<commit_message>
Actualizacion archivo 06 Feb
</commit_message>
<xml_diff>
--- a/Laboratorio AWS Jefferson Vargas 20260205 VPC.docx
+++ b/Laboratorio AWS Jefferson Vargas 20260205 VPC.docx
@@ -30,6 +30,9 @@
     </w:p>
     <w:p>
       <w:r>
+        <w:rPr>
+          <w:noProof/>
+        </w:rPr>
         <w:drawing>
           <wp:inline distT="0" distB="0" distL="0" distR="0" wp14:anchorId="2B4E0C81" wp14:editId="460B18BE">
             <wp:extent cx="4505325" cy="1668979"/>
@@ -69,6 +72,9 @@
     </w:p>
     <w:p>
       <w:r>
+        <w:rPr>
+          <w:noProof/>
+        </w:rPr>
         <w:drawing>
           <wp:inline distT="0" distB="0" distL="0" distR="0" wp14:anchorId="6AC0F0CC" wp14:editId="77B87AD6">
             <wp:extent cx="4607615" cy="3248999"/>
@@ -109,6 +115,9 @@
     <w:p/>
     <w:p>
       <w:r>
+        <w:rPr>
+          <w:noProof/>
+        </w:rPr>
         <w:drawing>
           <wp:inline distT="0" distB="0" distL="0" distR="0" wp14:anchorId="64842FE5" wp14:editId="2A2FFEEF">
             <wp:extent cx="5612130" cy="2361565"/>
@@ -148,6 +157,9 @@
     </w:p>
     <w:p>
       <w:r>
+        <w:rPr>
+          <w:noProof/>
+        </w:rPr>
         <w:lastRenderedPageBreak/>
         <w:drawing>
           <wp:inline distT="0" distB="0" distL="0" distR="0" wp14:anchorId="0C90752A" wp14:editId="6B8E8D6E">
@@ -189,6 +201,9 @@
     <w:p/>
     <w:p>
       <w:r>
+        <w:rPr>
+          <w:noProof/>
+        </w:rPr>
         <w:drawing>
           <wp:inline distT="0" distB="0" distL="0" distR="0" wp14:anchorId="0F90F7C9" wp14:editId="72BC3628">
             <wp:extent cx="5612130" cy="2106930"/>
@@ -229,6 +244,9 @@
     <w:p/>
     <w:p>
       <w:r>
+        <w:rPr>
+          <w:noProof/>
+        </w:rPr>
         <w:drawing>
           <wp:inline distT="0" distB="0" distL="0" distR="0" wp14:anchorId="449BDD14" wp14:editId="275A4091">
             <wp:extent cx="5612130" cy="2536190"/>
@@ -269,6 +287,9 @@
     <w:p/>
     <w:p>
       <w:r>
+        <w:rPr>
+          <w:noProof/>
+        </w:rPr>
         <w:lastRenderedPageBreak/>
         <w:drawing>
           <wp:inline distT="0" distB="0" distL="0" distR="0" wp14:anchorId="1C51E08C" wp14:editId="1538D5BF">
@@ -310,6 +331,9 @@
     <w:p/>
     <w:p>
       <w:r>
+        <w:rPr>
+          <w:noProof/>
+        </w:rPr>
         <w:drawing>
           <wp:inline distT="0" distB="0" distL="0" distR="0" wp14:anchorId="3AA434DF" wp14:editId="729A1106">
             <wp:extent cx="5612130" cy="3103245"/>
@@ -350,6 +374,9 @@
     <w:p/>
     <w:p>
       <w:r>
+        <w:rPr>
+          <w:noProof/>
+        </w:rPr>
         <w:drawing>
           <wp:inline distT="0" distB="0" distL="0" distR="0" wp14:anchorId="30EF2C67" wp14:editId="2A4EA9B0">
             <wp:extent cx="5612130" cy="962660"/>
@@ -389,6 +416,9 @@
     </w:p>
     <w:p>
       <w:r>
+        <w:rPr>
+          <w:noProof/>
+        </w:rPr>
         <w:lastRenderedPageBreak/>
         <w:drawing>
           <wp:inline distT="0" distB="0" distL="0" distR="0" wp14:anchorId="3BA4D93B" wp14:editId="5C4A9081">
@@ -430,6 +460,9 @@
     <w:p/>
     <w:p>
       <w:r>
+        <w:rPr>
+          <w:noProof/>
+        </w:rPr>
         <w:drawing>
           <wp:inline distT="0" distB="0" distL="0" distR="0" wp14:anchorId="798DAAD9" wp14:editId="2E6F1C56">
             <wp:extent cx="5612130" cy="2148205"/>
@@ -471,6 +504,9 @@
     <w:p/>
     <w:p>
       <w:r>
+        <w:rPr>
+          <w:noProof/>
+        </w:rPr>
         <w:lastRenderedPageBreak/>
         <w:drawing>
           <wp:inline distT="0" distB="0" distL="0" distR="0" wp14:anchorId="6C767D31" wp14:editId="770C99A8">
@@ -512,6 +548,9 @@
     <w:p/>
     <w:p>
       <w:r>
+        <w:rPr>
+          <w:noProof/>
+        </w:rPr>
         <w:drawing>
           <wp:inline distT="0" distB="0" distL="0" distR="0" wp14:anchorId="68A5A3C5" wp14:editId="145E2F2C">
             <wp:extent cx="5612130" cy="2156460"/>
@@ -578,8 +617,13 @@
       <w:pPr>
         <w:spacing w:after="0"/>
       </w:pPr>
-      <w:r>
-        <w:t>#!/bin/bash</w:t>
+      <w:proofErr w:type="gramStart"/>
+      <w:r>
+        <w:t>#!/</w:t>
+      </w:r>
+      <w:proofErr w:type="gramEnd"/>
+      <w:r>
+        <w:t>bin/bash</w:t>
       </w:r>
     </w:p>
     <w:p>
@@ -594,40 +638,115 @@
       <w:pPr>
         <w:spacing w:after="0"/>
       </w:pPr>
-      <w:r>
-        <w:t>yum update -y</w:t>
+      <w:proofErr w:type="spellStart"/>
+      <w:r>
+        <w:t>yum</w:t>
+      </w:r>
+      <w:proofErr w:type="spellEnd"/>
+      <w:r>
+        <w:t xml:space="preserve"> </w:t>
+      </w:r>
+      <w:proofErr w:type="spellStart"/>
+      <w:r>
+        <w:t>update</w:t>
+      </w:r>
+      <w:proofErr w:type="spellEnd"/>
+      <w:r>
+        <w:t xml:space="preserve"> -y</w:t>
       </w:r>
     </w:p>
     <w:p>
       <w:pPr>
         <w:spacing w:after="0"/>
       </w:pPr>
-      <w:r>
-        <w:t>yum install -y httpd</w:t>
-      </w:r>
+      <w:proofErr w:type="spellStart"/>
+      <w:r>
+        <w:t>yum</w:t>
+      </w:r>
+      <w:proofErr w:type="spellEnd"/>
+      <w:r>
+        <w:t xml:space="preserve"> </w:t>
+      </w:r>
+      <w:proofErr w:type="spellStart"/>
+      <w:r>
+        <w:t>install</w:t>
+      </w:r>
+      <w:proofErr w:type="spellEnd"/>
+      <w:r>
+        <w:t xml:space="preserve"> -y </w:t>
+      </w:r>
+      <w:proofErr w:type="spellStart"/>
+      <w:r>
+        <w:t>httpd</w:t>
+      </w:r>
+      <w:proofErr w:type="spellEnd"/>
     </w:p>
     <w:p>
       <w:pPr>
         <w:spacing w:after="0"/>
       </w:pPr>
-      <w:r>
-        <w:t>systemctl start httpd</w:t>
-      </w:r>
+      <w:proofErr w:type="spellStart"/>
+      <w:r>
+        <w:t>systemctl</w:t>
+      </w:r>
+      <w:proofErr w:type="spellEnd"/>
+      <w:r>
+        <w:t xml:space="preserve"> </w:t>
+      </w:r>
+      <w:proofErr w:type="spellStart"/>
+      <w:r>
+        <w:t>start</w:t>
+      </w:r>
+      <w:proofErr w:type="spellEnd"/>
+      <w:r>
+        <w:t xml:space="preserve"> </w:t>
+      </w:r>
+      <w:proofErr w:type="spellStart"/>
+      <w:r>
+        <w:t>httpd</w:t>
+      </w:r>
+      <w:proofErr w:type="spellEnd"/>
     </w:p>
     <w:p>
       <w:pPr>
         <w:spacing w:after="0"/>
       </w:pPr>
-      <w:r>
-        <w:t>systemctl enable httpd</w:t>
-      </w:r>
+      <w:proofErr w:type="spellStart"/>
+      <w:r>
+        <w:t>systemctl</w:t>
+      </w:r>
+      <w:proofErr w:type="spellEnd"/>
+      <w:r>
+        <w:t xml:space="preserve"> </w:t>
+      </w:r>
+      <w:proofErr w:type="spellStart"/>
+      <w:r>
+        <w:t>enable</w:t>
+      </w:r>
+      <w:proofErr w:type="spellEnd"/>
+      <w:r>
+        <w:t xml:space="preserve"> </w:t>
+      </w:r>
+      <w:proofErr w:type="spellStart"/>
+      <w:r>
+        <w:t>httpd</w:t>
+      </w:r>
+      <w:proofErr w:type="spellEnd"/>
     </w:p>
     <w:p>
       <w:pPr>
         <w:spacing w:after="0"/>
       </w:pPr>
       <w:r>
-        <w:t xml:space="preserve">echo "&lt;h1&gt;Demo AWS Networking </w:t>
+        <w:t xml:space="preserve">echo "&lt;h1&gt;Demo AWS </w:t>
+      </w:r>
+      <w:proofErr w:type="spellStart"/>
+      <w:r>
+        <w:t>Networking</w:t>
+      </w:r>
+      <w:proofErr w:type="spellEnd"/>
+      <w:r>
+        <w:t xml:space="preserve"> </w:t>
       </w:r>
       <w:r>
         <w:rPr>
@@ -644,7 +763,23 @@
         <w:spacing w:after="0"/>
       </w:pPr>
       <w:r>
-        <w:t>&lt;p&gt;VPC, Subnet, SG, Route 53 y CloudFront&lt;/p&gt;</w:t>
+        <w:t xml:space="preserve">&lt;p&gt;VPC, </w:t>
+      </w:r>
+      <w:proofErr w:type="spellStart"/>
+      <w:r>
+        <w:t>Subnet</w:t>
+      </w:r>
+      <w:proofErr w:type="spellEnd"/>
+      <w:r>
+        <w:t xml:space="preserve">, SG, Route 53 y </w:t>
+      </w:r>
+      <w:proofErr w:type="spellStart"/>
+      <w:r>
+        <w:t>CloudFront</w:t>
+      </w:r>
+      <w:proofErr w:type="spellEnd"/>
+      <w:r>
+        <w:t>&lt;/p&gt;</w:t>
       </w:r>
     </w:p>
     <w:p>
@@ -652,11 +787,38 @@
         <w:spacing w:after="0"/>
       </w:pPr>
       <w:r>
-        <w:t>&lt;p&gt;Servidor: $(hostname)&lt;/p&gt;" &gt; /var/www/html/index.html</w:t>
-      </w:r>
-    </w:p>
-    <w:p>
-      <w:r>
+        <w:t>&lt;p&gt;Servidor: $(</w:t>
+      </w:r>
+      <w:proofErr w:type="spellStart"/>
+      <w:r>
+        <w:t>hostname</w:t>
+      </w:r>
+      <w:proofErr w:type="spellEnd"/>
+      <w:r>
+        <w:t>)&lt;/p&gt;" &gt; /</w:t>
+      </w:r>
+      <w:proofErr w:type="spellStart"/>
+      <w:r>
+        <w:t>var</w:t>
+      </w:r>
+      <w:proofErr w:type="spellEnd"/>
+      <w:r>
+        <w:t>/www/</w:t>
+      </w:r>
+      <w:proofErr w:type="spellStart"/>
+      <w:r>
+        <w:t>html</w:t>
+      </w:r>
+      <w:proofErr w:type="spellEnd"/>
+      <w:r>
+        <w:t>/index.html</w:t>
+      </w:r>
+    </w:p>
+    <w:p>
+      <w:r>
+        <w:rPr>
+          <w:noProof/>
+        </w:rPr>
         <w:lastRenderedPageBreak/>
         <w:drawing>
           <wp:inline distT="0" distB="0" distL="0" distR="0" wp14:anchorId="7C176CB1" wp14:editId="29B1AC40">
@@ -695,6 +857,207 @@
         </w:drawing>
       </w:r>
     </w:p>
+    <w:p>
+      <w:r>
+        <w:drawing>
+          <wp:inline distT="0" distB="0" distL="0" distR="0" wp14:anchorId="75B2312A" wp14:editId="6EF0AB0B">
+            <wp:extent cx="5612130" cy="2280920"/>
+            <wp:effectExtent l="0" t="0" r="7620" b="5080"/>
+            <wp:docPr id="114967870" name="Imagen 1"/>
+            <wp:cNvGraphicFramePr>
+              <a:graphicFrameLocks xmlns:a="http://schemas.openxmlformats.org/drawingml/2006/main" noChangeAspect="1"/>
+            </wp:cNvGraphicFramePr>
+            <a:graphic xmlns:a="http://schemas.openxmlformats.org/drawingml/2006/main">
+              <a:graphicData uri="http://schemas.openxmlformats.org/drawingml/2006/picture">
+                <pic:pic xmlns:pic="http://schemas.openxmlformats.org/drawingml/2006/picture">
+                  <pic:nvPicPr>
+                    <pic:cNvPr id="114967870" name=""/>
+                    <pic:cNvPicPr/>
+                  </pic:nvPicPr>
+                  <pic:blipFill>
+                    <a:blip r:embed="rId18"/>
+                    <a:stretch>
+                      <a:fillRect/>
+                    </a:stretch>
+                  </pic:blipFill>
+                  <pic:spPr>
+                    <a:xfrm>
+                      <a:off x="0" y="0"/>
+                      <a:ext cx="5612130" cy="2280920"/>
+                    </a:xfrm>
+                    <a:prstGeom prst="rect">
+                      <a:avLst/>
+                    </a:prstGeom>
+                  </pic:spPr>
+                </pic:pic>
+              </a:graphicData>
+            </a:graphic>
+          </wp:inline>
+        </w:drawing>
+      </w:r>
+    </w:p>
+    <w:p>
+      <w:r>
+        <w:drawing>
+          <wp:inline distT="0" distB="0" distL="0" distR="0" wp14:anchorId="55531E60" wp14:editId="4AD7D6DE">
+            <wp:extent cx="5612130" cy="2362835"/>
+            <wp:effectExtent l="0" t="0" r="7620" b="0"/>
+            <wp:docPr id="752996531" name="Imagen 1"/>
+            <wp:cNvGraphicFramePr>
+              <a:graphicFrameLocks xmlns:a="http://schemas.openxmlformats.org/drawingml/2006/main" noChangeAspect="1"/>
+            </wp:cNvGraphicFramePr>
+            <a:graphic xmlns:a="http://schemas.openxmlformats.org/drawingml/2006/main">
+              <a:graphicData uri="http://schemas.openxmlformats.org/drawingml/2006/picture">
+                <pic:pic xmlns:pic="http://schemas.openxmlformats.org/drawingml/2006/picture">
+                  <pic:nvPicPr>
+                    <pic:cNvPr id="752996531" name=""/>
+                    <pic:cNvPicPr/>
+                  </pic:nvPicPr>
+                  <pic:blipFill>
+                    <a:blip r:embed="rId19"/>
+                    <a:stretch>
+                      <a:fillRect/>
+                    </a:stretch>
+                  </pic:blipFill>
+                  <pic:spPr>
+                    <a:xfrm>
+                      <a:off x="0" y="0"/>
+                      <a:ext cx="5612130" cy="2362835"/>
+                    </a:xfrm>
+                    <a:prstGeom prst="rect">
+                      <a:avLst/>
+                    </a:prstGeom>
+                  </pic:spPr>
+                </pic:pic>
+              </a:graphicData>
+            </a:graphic>
+          </wp:inline>
+        </w:drawing>
+      </w:r>
+    </w:p>
+    <w:p>
+      <w:r>
+        <w:lastRenderedPageBreak/>
+        <w:drawing>
+          <wp:inline distT="0" distB="0" distL="0" distR="0" wp14:anchorId="3FC21A35" wp14:editId="23D30429">
+            <wp:extent cx="5612130" cy="2457450"/>
+            <wp:effectExtent l="0" t="0" r="7620" b="0"/>
+            <wp:docPr id="1906271426" name="Imagen 1"/>
+            <wp:cNvGraphicFramePr>
+              <a:graphicFrameLocks xmlns:a="http://schemas.openxmlformats.org/drawingml/2006/main" noChangeAspect="1"/>
+            </wp:cNvGraphicFramePr>
+            <a:graphic xmlns:a="http://schemas.openxmlformats.org/drawingml/2006/main">
+              <a:graphicData uri="http://schemas.openxmlformats.org/drawingml/2006/picture">
+                <pic:pic xmlns:pic="http://schemas.openxmlformats.org/drawingml/2006/picture">
+                  <pic:nvPicPr>
+                    <pic:cNvPr id="1906271426" name=""/>
+                    <pic:cNvPicPr/>
+                  </pic:nvPicPr>
+                  <pic:blipFill>
+                    <a:blip r:embed="rId20"/>
+                    <a:stretch>
+                      <a:fillRect/>
+                    </a:stretch>
+                  </pic:blipFill>
+                  <pic:spPr>
+                    <a:xfrm>
+                      <a:off x="0" y="0"/>
+                      <a:ext cx="5612130" cy="2457450"/>
+                    </a:xfrm>
+                    <a:prstGeom prst="rect">
+                      <a:avLst/>
+                    </a:prstGeom>
+                  </pic:spPr>
+                </pic:pic>
+              </a:graphicData>
+            </a:graphic>
+          </wp:inline>
+        </w:drawing>
+      </w:r>
+    </w:p>
+    <w:p/>
+    <w:p>
+      <w:r>
+        <w:drawing>
+          <wp:inline distT="0" distB="0" distL="0" distR="0" wp14:anchorId="0E4E24FF" wp14:editId="77ADABF2">
+            <wp:extent cx="5612130" cy="3665220"/>
+            <wp:effectExtent l="0" t="0" r="7620" b="0"/>
+            <wp:docPr id="936545515" name="Imagen 1"/>
+            <wp:cNvGraphicFramePr>
+              <a:graphicFrameLocks xmlns:a="http://schemas.openxmlformats.org/drawingml/2006/main" noChangeAspect="1"/>
+            </wp:cNvGraphicFramePr>
+            <a:graphic xmlns:a="http://schemas.openxmlformats.org/drawingml/2006/main">
+              <a:graphicData uri="http://schemas.openxmlformats.org/drawingml/2006/picture">
+                <pic:pic xmlns:pic="http://schemas.openxmlformats.org/drawingml/2006/picture">
+                  <pic:nvPicPr>
+                    <pic:cNvPr id="936545515" name=""/>
+                    <pic:cNvPicPr/>
+                  </pic:nvPicPr>
+                  <pic:blipFill>
+                    <a:blip r:embed="rId21"/>
+                    <a:stretch>
+                      <a:fillRect/>
+                    </a:stretch>
+                  </pic:blipFill>
+                  <pic:spPr>
+                    <a:xfrm>
+                      <a:off x="0" y="0"/>
+                      <a:ext cx="5612130" cy="3665220"/>
+                    </a:xfrm>
+                    <a:prstGeom prst="rect">
+                      <a:avLst/>
+                    </a:prstGeom>
+                  </pic:spPr>
+                </pic:pic>
+              </a:graphicData>
+            </a:graphic>
+          </wp:inline>
+        </w:drawing>
+      </w:r>
+    </w:p>
+    <w:p/>
+    <w:p/>
+    <w:p>
+      <w:r>
+        <w:lastRenderedPageBreak/>
+        <w:drawing>
+          <wp:inline distT="0" distB="0" distL="0" distR="0" wp14:anchorId="3800F917" wp14:editId="3D45BC17">
+            <wp:extent cx="5612130" cy="3641090"/>
+            <wp:effectExtent l="0" t="0" r="7620" b="0"/>
+            <wp:docPr id="534893731" name="Imagen 1"/>
+            <wp:cNvGraphicFramePr>
+              <a:graphicFrameLocks xmlns:a="http://schemas.openxmlformats.org/drawingml/2006/main" noChangeAspect="1"/>
+            </wp:cNvGraphicFramePr>
+            <a:graphic xmlns:a="http://schemas.openxmlformats.org/drawingml/2006/main">
+              <a:graphicData uri="http://schemas.openxmlformats.org/drawingml/2006/picture">
+                <pic:pic xmlns:pic="http://schemas.openxmlformats.org/drawingml/2006/picture">
+                  <pic:nvPicPr>
+                    <pic:cNvPr id="534893731" name=""/>
+                    <pic:cNvPicPr/>
+                  </pic:nvPicPr>
+                  <pic:blipFill>
+                    <a:blip r:embed="rId22"/>
+                    <a:stretch>
+                      <a:fillRect/>
+                    </a:stretch>
+                  </pic:blipFill>
+                  <pic:spPr>
+                    <a:xfrm>
+                      <a:off x="0" y="0"/>
+                      <a:ext cx="5612130" cy="3641090"/>
+                    </a:xfrm>
+                    <a:prstGeom prst="rect">
+                      <a:avLst/>
+                    </a:prstGeom>
+                  </pic:spPr>
+                </pic:pic>
+              </a:graphicData>
+            </a:graphic>
+          </wp:inline>
+        </w:drawing>
+      </w:r>
+    </w:p>
+    <w:p/>
     <w:p/>
     <w:p/>
     <w:p/>
@@ -1310,6 +1673,7 @@
   <w:style w:type="character" w:default="1" w:styleId="Fuentedeprrafopredeter">
     <w:name w:val="Default Paragraph Font"/>
     <w:uiPriority w:val="1"/>
+    <w:semiHidden/>
     <w:unhideWhenUsed/>
   </w:style>
   <w:style w:type="table" w:default="1" w:styleId="Tablanormal">

</xml_diff>